<commit_message>
update deep dive (cosmetic)
</commit_message>
<xml_diff>
--- a/companion_notes/deep_dives/Deep_Dive_in_the_SPLM_model_and_code.docx
+++ b/companion_notes/deep_dives/Deep_Dive_in_the_SPLM_model_and_code.docx
@@ -1,6 +1,6 @@
 
 <file path=word/document.xml><?xml version="1.0" encoding="utf-8"?>
-<w:document xmlns:wpc="http://schemas.microsoft.com/office/word/2010/wordprocessingCanvas" xmlns:cx="http://schemas.microsoft.com/office/drawing/2014/chartex" xmlns:cx1="http://schemas.microsoft.com/office/drawing/2015/9/8/chartex" xmlns:cx2="http://schemas.microsoft.com/office/drawing/2015/10/21/chartex" xmlns:cx3="http://schemas.microsoft.com/office/drawing/2016/5/9/chartex" xmlns:cx4="http://schemas.microsoft.com/office/drawing/2016/5/10/chartex" xmlns:cx5="http://schemas.microsoft.com/office/drawing/2016/5/11/chartex" xmlns:cx6="http://schemas.microsoft.com/office/drawing/2016/5/12/chartex" xmlns:cx7="http://schemas.microsoft.com/office/drawing/2016/5/13/chartex" xmlns:cx8="http://schemas.microsoft.com/office/drawing/2016/5/14/chartex" xmlns:mc="http://schemas.openxmlformats.org/markup-compatibility/2006" xmlns:aink="http://schemas.microsoft.com/office/drawing/2016/ink" xmlns:am3d="http://schemas.microsoft.com/office/drawing/2017/model3d" xmlns:o="urn:schemas-microsoft-com:office:office" xmlns:oel="http://schemas.microsoft.com/office/2019/extlst" xmlns:r="http://schemas.openxmlformats.org/officeDocument/2006/relationships" xmlns:m="http://schemas.openxmlformats.org/officeDocument/2006/math" xmlns:v="urn:schemas-microsoft-com:vml" xmlns:wp14="http://schemas.microsoft.com/office/word/2010/wordprocessingDrawing" xmlns:wp="http://schemas.openxmlformats.org/drawingml/2006/wordprocessingDrawing" xmlns:w10="urn:schemas-microsoft-com:office:word" xmlns:w="http://schemas.openxmlformats.org/wordprocessingml/2006/main" xmlns:w14="http://schemas.microsoft.com/office/word/2010/wordml" xmlns:w15="http://schemas.microsoft.com/office/word/2012/wordml" xmlns:w16cex="http://schemas.microsoft.com/office/word/2018/wordml/cex" xmlns:w16cid="http://schemas.microsoft.com/office/word/2016/wordml/cid" xmlns:w16="http://schemas.microsoft.com/office/word/2018/wordml" xmlns:w16du="http://schemas.microsoft.com/office/word/2023/wordml/word16du" xmlns:w16sdtdh="http://schemas.microsoft.com/office/word/2020/wordml/sdtdatahash" xmlns:w16sdtfl="http://schemas.microsoft.com/office/word/2024/wordml/sdtformatlock" xmlns:w16se="http://schemas.microsoft.com/office/word/2015/wordml/symex" xmlns:wpg="http://schemas.microsoft.com/office/word/2010/wordprocessingGroup" xmlns:wpi="http://schemas.microsoft.com/office/word/2010/wordprocessingInk" xmlns:wne="http://schemas.microsoft.com/office/word/2006/wordml" xmlns:wps="http://schemas.microsoft.com/office/word/2010/wordprocessingShape" mc:Ignorable="w14 w15 w16se w16cid w16 w16cex w16sdtdh w16sdtfl w16du wp14">
+<w:document xmlns:wpc="http://schemas.microsoft.com/office/word/2010/wordprocessingCanvas" xmlns:cx="http://schemas.microsoft.com/office/drawing/2014/chartex" xmlns:cx1="http://schemas.microsoft.com/office/drawing/2015/9/8/chartex" xmlns:cx2="http://schemas.microsoft.com/office/drawing/2015/10/21/chartex" xmlns:cx3="http://schemas.microsoft.com/office/drawing/2016/5/9/chartex" xmlns:cx4="http://schemas.microsoft.com/office/drawing/2016/5/10/chartex" xmlns:cx5="http://schemas.microsoft.com/office/drawing/2016/5/11/chartex" xmlns:cx6="http://schemas.microsoft.com/office/drawing/2016/5/12/chartex" xmlns:cx7="http://schemas.microsoft.com/office/drawing/2016/5/13/chartex" xmlns:cx8="http://schemas.microsoft.com/office/drawing/2016/5/14/chartex" xmlns:mc="http://schemas.openxmlformats.org/markup-compatibility/2006" xmlns:aink="http://schemas.microsoft.com/office/drawing/2016/ink" xmlns:am3d="http://schemas.microsoft.com/office/drawing/2017/model3d" xmlns:o="urn:schemas-microsoft-com:office:office" xmlns:oel="http://schemas.microsoft.com/office/2019/extlst" xmlns:r="http://schemas.openxmlformats.org/officeDocument/2006/relationships" xmlns:m="http://schemas.openxmlformats.org/officeDocument/2006/math" xmlns:v="urn:schemas-microsoft-com:vml" xmlns:wp14="http://schemas.microsoft.com/office/word/2010/wordprocessingDrawing" xmlns:wp="http://schemas.openxmlformats.org/drawingml/2006/wordprocessingDrawing" xmlns:w10="urn:schemas-microsoft-com:office:word" xmlns:w="http://schemas.openxmlformats.org/wordprocessingml/2006/main" xmlns:w14="http://schemas.microsoft.com/office/word/2010/wordml" xmlns:w15="http://schemas.microsoft.com/office/word/2012/wordml" xmlns:w16cex="http://schemas.microsoft.com/office/word/2018/wordml/cex" xmlns:w16cid="http://schemas.microsoft.com/office/word/2016/wordml/cid" xmlns:w16="http://schemas.microsoft.com/office/word/2018/wordml" xmlns:w16sdtdh="http://schemas.microsoft.com/office/word/2020/wordml/sdtdatahash" xmlns:w16se="http://schemas.microsoft.com/office/word/2015/wordml/symex" xmlns:wpg="http://schemas.microsoft.com/office/word/2010/wordprocessingGroup" xmlns:wpi="http://schemas.microsoft.com/office/word/2010/wordprocessingInk" xmlns:wne="http://schemas.microsoft.com/office/word/2006/wordml" xmlns:wps="http://schemas.microsoft.com/office/word/2010/wordprocessingShape" mc:Ignorable="w14 w15 w16se w16cid w16 w16cex w16sdtdh wp14">
   <w:body>
     <w:p>
       <w:pPr>
@@ -884,23 +884,7 @@
                 <w:rFonts w:ascii="Consolas" w:hAnsi="Consolas"/>
                 <w:noProof/>
               </w:rPr>
-              <w:t>shared_potent</w:t>
-            </w:r>
-            <w:r>
-              <w:rPr>
-                <w:rStyle w:val="Hyperlink"/>
-                <w:rFonts w:ascii="Consolas" w:hAnsi="Consolas"/>
-                <w:noProof/>
-              </w:rPr>
-              <w:t>i</w:t>
-            </w:r>
-            <w:r>
-              <w:rPr>
-                <w:rStyle w:val="Hyperlink"/>
-                <w:rFonts w:ascii="Consolas" w:hAnsi="Consolas"/>
-                <w:noProof/>
-              </w:rPr>
-              <w:t>al_fit.py</w:t>
+              <w:t>shared_potential_fit.py</w:t>
             </w:r>
             <w:r>
               <w:rPr>
@@ -19774,10 +19758,7 @@
       </w:pPr>
       <w:bookmarkStart w:id="13" w:name="_Toc231120056"/>
       <w:r>
-        <w:t>A Note on t</w:t>
-      </w:r>
-      <w:r>
-        <w:t>he Causal Probe (</w:t>
+        <w:t>A Note on the Causal Probe (</w:t>
       </w:r>
       <w:r>
         <w:rPr>
@@ -51081,19 +51062,13 @@
           </m:sup>
         </m:sSup>
         <m:r>
-          <w:rPr>
-            <w:rFonts w:ascii="Cambria Math" w:hAnsi="Cambria Math"/>
-          </w:rPr>
-          <m:t>→</m:t>
-        </m:r>
-        <m:r>
           <m:rPr>
             <m:scr m:val="double-struck"/>
           </m:rPr>
           <w:rPr>
             <w:rFonts w:ascii="Cambria Math" w:hAnsi="Cambria Math"/>
           </w:rPr>
-          <m:t>R</m:t>
+          <m:t>→R</m:t>
         </m:r>
       </m:oMath>
       <w:r>
@@ -58780,7 +58755,7 @@
 </file>
 
 <file path=word/endnotes.xml><?xml version="1.0" encoding="utf-8"?>
-<w:endnotes xmlns:wpc="http://schemas.microsoft.com/office/word/2010/wordprocessingCanvas" xmlns:cx="http://schemas.microsoft.com/office/drawing/2014/chartex" xmlns:cx1="http://schemas.microsoft.com/office/drawing/2015/9/8/chartex" xmlns:cx2="http://schemas.microsoft.com/office/drawing/2015/10/21/chartex" xmlns:cx3="http://schemas.microsoft.com/office/drawing/2016/5/9/chartex" xmlns:cx4="http://schemas.microsoft.com/office/drawing/2016/5/10/chartex" xmlns:cx5="http://schemas.microsoft.com/office/drawing/2016/5/11/chartex" xmlns:cx6="http://schemas.microsoft.com/office/drawing/2016/5/12/chartex" xmlns:cx7="http://schemas.microsoft.com/office/drawing/2016/5/13/chartex" xmlns:cx8="http://schemas.microsoft.com/office/drawing/2016/5/14/chartex" xmlns:mc="http://schemas.openxmlformats.org/markup-compatibility/2006" xmlns:aink="http://schemas.microsoft.com/office/drawing/2016/ink" xmlns:am3d="http://schemas.microsoft.com/office/drawing/2017/model3d" xmlns:o="urn:schemas-microsoft-com:office:office" xmlns:oel="http://schemas.microsoft.com/office/2019/extlst" xmlns:r="http://schemas.openxmlformats.org/officeDocument/2006/relationships" xmlns:m="http://schemas.openxmlformats.org/officeDocument/2006/math" xmlns:v="urn:schemas-microsoft-com:vml" xmlns:wp14="http://schemas.microsoft.com/office/word/2010/wordprocessingDrawing" xmlns:wp="http://schemas.openxmlformats.org/drawingml/2006/wordprocessingDrawing" xmlns:w10="urn:schemas-microsoft-com:office:word" xmlns:w="http://schemas.openxmlformats.org/wordprocessingml/2006/main" xmlns:w14="http://schemas.microsoft.com/office/word/2010/wordml" xmlns:w15="http://schemas.microsoft.com/office/word/2012/wordml" xmlns:w16cex="http://schemas.microsoft.com/office/word/2018/wordml/cex" xmlns:w16cid="http://schemas.microsoft.com/office/word/2016/wordml/cid" xmlns:w16="http://schemas.microsoft.com/office/word/2018/wordml" xmlns:w16du="http://schemas.microsoft.com/office/word/2023/wordml/word16du" xmlns:w16sdtdh="http://schemas.microsoft.com/office/word/2020/wordml/sdtdatahash" xmlns:w16sdtfl="http://schemas.microsoft.com/office/word/2024/wordml/sdtformatlock" xmlns:w16se="http://schemas.microsoft.com/office/word/2015/wordml/symex" xmlns:wpg="http://schemas.microsoft.com/office/word/2010/wordprocessingGroup" xmlns:wpi="http://schemas.microsoft.com/office/word/2010/wordprocessingInk" xmlns:wne="http://schemas.microsoft.com/office/word/2006/wordml" xmlns:wps="http://schemas.microsoft.com/office/word/2010/wordprocessingShape" mc:Ignorable="w14 w15 w16se w16cid w16 w16cex w16sdtdh w16sdtfl w16du wp14">
+<w:endnotes xmlns:wpc="http://schemas.microsoft.com/office/word/2010/wordprocessingCanvas" xmlns:cx="http://schemas.microsoft.com/office/drawing/2014/chartex" xmlns:cx1="http://schemas.microsoft.com/office/drawing/2015/9/8/chartex" xmlns:cx2="http://schemas.microsoft.com/office/drawing/2015/10/21/chartex" xmlns:cx3="http://schemas.microsoft.com/office/drawing/2016/5/9/chartex" xmlns:cx4="http://schemas.microsoft.com/office/drawing/2016/5/10/chartex" xmlns:cx5="http://schemas.microsoft.com/office/drawing/2016/5/11/chartex" xmlns:cx6="http://schemas.microsoft.com/office/drawing/2016/5/12/chartex" xmlns:cx7="http://schemas.microsoft.com/office/drawing/2016/5/13/chartex" xmlns:cx8="http://schemas.microsoft.com/office/drawing/2016/5/14/chartex" xmlns:mc="http://schemas.openxmlformats.org/markup-compatibility/2006" xmlns:aink="http://schemas.microsoft.com/office/drawing/2016/ink" xmlns:am3d="http://schemas.microsoft.com/office/drawing/2017/model3d" xmlns:o="urn:schemas-microsoft-com:office:office" xmlns:oel="http://schemas.microsoft.com/office/2019/extlst" xmlns:r="http://schemas.openxmlformats.org/officeDocument/2006/relationships" xmlns:m="http://schemas.openxmlformats.org/officeDocument/2006/math" xmlns:v="urn:schemas-microsoft-com:vml" xmlns:wp14="http://schemas.microsoft.com/office/word/2010/wordprocessingDrawing" xmlns:wp="http://schemas.openxmlformats.org/drawingml/2006/wordprocessingDrawing" xmlns:w10="urn:schemas-microsoft-com:office:word" xmlns:w="http://schemas.openxmlformats.org/wordprocessingml/2006/main" xmlns:w14="http://schemas.microsoft.com/office/word/2010/wordml" xmlns:w15="http://schemas.microsoft.com/office/word/2012/wordml" xmlns:w16cex="http://schemas.microsoft.com/office/word/2018/wordml/cex" xmlns:w16cid="http://schemas.microsoft.com/office/word/2016/wordml/cid" xmlns:w16="http://schemas.microsoft.com/office/word/2018/wordml" xmlns:w16sdtdh="http://schemas.microsoft.com/office/word/2020/wordml/sdtdatahash" xmlns:w16se="http://schemas.microsoft.com/office/word/2015/wordml/symex" xmlns:wpg="http://schemas.microsoft.com/office/word/2010/wordprocessingGroup" xmlns:wpi="http://schemas.microsoft.com/office/word/2010/wordprocessingInk" xmlns:wne="http://schemas.microsoft.com/office/word/2006/wordml" xmlns:wps="http://schemas.microsoft.com/office/word/2010/wordprocessingShape" mc:Ignorable="w14 w15 w16se w16cid w16 w16cex w16sdtdh wp14">
   <w:endnote w:type="separator" w:id="-1">
     <w:p>
       <w:pPr>
@@ -58805,7 +58780,7 @@
 </file>
 
 <file path=word/footnotes.xml><?xml version="1.0" encoding="utf-8"?>
-<w:footnotes xmlns:wpc="http://schemas.microsoft.com/office/word/2010/wordprocessingCanvas" xmlns:cx="http://schemas.microsoft.com/office/drawing/2014/chartex" xmlns:cx1="http://schemas.microsoft.com/office/drawing/2015/9/8/chartex" xmlns:cx2="http://schemas.microsoft.com/office/drawing/2015/10/21/chartex" xmlns:cx3="http://schemas.microsoft.com/office/drawing/2016/5/9/chartex" xmlns:cx4="http://schemas.microsoft.com/office/drawing/2016/5/10/chartex" xmlns:cx5="http://schemas.microsoft.com/office/drawing/2016/5/11/chartex" xmlns:cx6="http://schemas.microsoft.com/office/drawing/2016/5/12/chartex" xmlns:cx7="http://schemas.microsoft.com/office/drawing/2016/5/13/chartex" xmlns:cx8="http://schemas.microsoft.com/office/drawing/2016/5/14/chartex" xmlns:mc="http://schemas.openxmlformats.org/markup-compatibility/2006" xmlns:aink="http://schemas.microsoft.com/office/drawing/2016/ink" xmlns:am3d="http://schemas.microsoft.com/office/drawing/2017/model3d" xmlns:o="urn:schemas-microsoft-com:office:office" xmlns:oel="http://schemas.microsoft.com/office/2019/extlst" xmlns:r="http://schemas.openxmlformats.org/officeDocument/2006/relationships" xmlns:m="http://schemas.openxmlformats.org/officeDocument/2006/math" xmlns:v="urn:schemas-microsoft-com:vml" xmlns:wp14="http://schemas.microsoft.com/office/word/2010/wordprocessingDrawing" xmlns:wp="http://schemas.openxmlformats.org/drawingml/2006/wordprocessingDrawing" xmlns:w10="urn:schemas-microsoft-com:office:word" xmlns:w="http://schemas.openxmlformats.org/wordprocessingml/2006/main" xmlns:w14="http://schemas.microsoft.com/office/word/2010/wordml" xmlns:w15="http://schemas.microsoft.com/office/word/2012/wordml" xmlns:w16cex="http://schemas.microsoft.com/office/word/2018/wordml/cex" xmlns:w16cid="http://schemas.microsoft.com/office/word/2016/wordml/cid" xmlns:w16="http://schemas.microsoft.com/office/word/2018/wordml" xmlns:w16du="http://schemas.microsoft.com/office/word/2023/wordml/word16du" xmlns:w16sdtdh="http://schemas.microsoft.com/office/word/2020/wordml/sdtdatahash" xmlns:w16sdtfl="http://schemas.microsoft.com/office/word/2024/wordml/sdtformatlock" xmlns:w16se="http://schemas.microsoft.com/office/word/2015/wordml/symex" xmlns:wpg="http://schemas.microsoft.com/office/word/2010/wordprocessingGroup" xmlns:wpi="http://schemas.microsoft.com/office/word/2010/wordprocessingInk" xmlns:wne="http://schemas.microsoft.com/office/word/2006/wordml" xmlns:wps="http://schemas.microsoft.com/office/word/2010/wordprocessingShape" mc:Ignorable="w14 w15 w16se w16cid w16 w16cex w16sdtdh w16sdtfl w16du wp14">
+<w:footnotes xmlns:wpc="http://schemas.microsoft.com/office/word/2010/wordprocessingCanvas" xmlns:cx="http://schemas.microsoft.com/office/drawing/2014/chartex" xmlns:cx1="http://schemas.microsoft.com/office/drawing/2015/9/8/chartex" xmlns:cx2="http://schemas.microsoft.com/office/drawing/2015/10/21/chartex" xmlns:cx3="http://schemas.microsoft.com/office/drawing/2016/5/9/chartex" xmlns:cx4="http://schemas.microsoft.com/office/drawing/2016/5/10/chartex" xmlns:cx5="http://schemas.microsoft.com/office/drawing/2016/5/11/chartex" xmlns:cx6="http://schemas.microsoft.com/office/drawing/2016/5/12/chartex" xmlns:cx7="http://schemas.microsoft.com/office/drawing/2016/5/13/chartex" xmlns:cx8="http://schemas.microsoft.com/office/drawing/2016/5/14/chartex" xmlns:mc="http://schemas.openxmlformats.org/markup-compatibility/2006" xmlns:aink="http://schemas.microsoft.com/office/drawing/2016/ink" xmlns:am3d="http://schemas.microsoft.com/office/drawing/2017/model3d" xmlns:o="urn:schemas-microsoft-com:office:office" xmlns:oel="http://schemas.microsoft.com/office/2019/extlst" xmlns:r="http://schemas.openxmlformats.org/officeDocument/2006/relationships" xmlns:m="http://schemas.openxmlformats.org/officeDocument/2006/math" xmlns:v="urn:schemas-microsoft-com:vml" xmlns:wp14="http://schemas.microsoft.com/office/word/2010/wordprocessingDrawing" xmlns:wp="http://schemas.openxmlformats.org/drawingml/2006/wordprocessingDrawing" xmlns:w10="urn:schemas-microsoft-com:office:word" xmlns:w="http://schemas.openxmlformats.org/wordprocessingml/2006/main" xmlns:w14="http://schemas.microsoft.com/office/word/2010/wordml" xmlns:w15="http://schemas.microsoft.com/office/word/2012/wordml" xmlns:w16cex="http://schemas.microsoft.com/office/word/2018/wordml/cex" xmlns:w16cid="http://schemas.microsoft.com/office/word/2016/wordml/cid" xmlns:w16="http://schemas.microsoft.com/office/word/2018/wordml" xmlns:w16sdtdh="http://schemas.microsoft.com/office/word/2020/wordml/sdtdatahash" xmlns:w16se="http://schemas.microsoft.com/office/word/2015/wordml/symex" xmlns:wpg="http://schemas.microsoft.com/office/word/2010/wordprocessingGroup" xmlns:wpi="http://schemas.microsoft.com/office/word/2010/wordprocessingInk" xmlns:wne="http://schemas.microsoft.com/office/word/2006/wordml" xmlns:wps="http://schemas.microsoft.com/office/word/2010/wordprocessingShape" mc:Ignorable="w14 w15 w16se w16cid w16 w16cex w16sdtdh wp14">
   <w:footnote w:type="separator" w:id="-1">
     <w:p>
       <w:pPr>
@@ -59718,7 +59693,7 @@
 </file>
 
 <file path=word/numbering.xml><?xml version="1.0" encoding="utf-8"?>
-<w:numbering xmlns:wpc="http://schemas.microsoft.com/office/word/2010/wordprocessingCanvas" xmlns:cx="http://schemas.microsoft.com/office/drawing/2014/chartex" xmlns:cx1="http://schemas.microsoft.com/office/drawing/2015/9/8/chartex" xmlns:cx2="http://schemas.microsoft.com/office/drawing/2015/10/21/chartex" xmlns:cx3="http://schemas.microsoft.com/office/drawing/2016/5/9/chartex" xmlns:cx4="http://schemas.microsoft.com/office/drawing/2016/5/10/chartex" xmlns:cx5="http://schemas.microsoft.com/office/drawing/2016/5/11/chartex" xmlns:cx6="http://schemas.microsoft.com/office/drawing/2016/5/12/chartex" xmlns:cx7="http://schemas.microsoft.com/office/drawing/2016/5/13/chartex" xmlns:cx8="http://schemas.microsoft.com/office/drawing/2016/5/14/chartex" xmlns:mc="http://schemas.openxmlformats.org/markup-compatibility/2006" xmlns:aink="http://schemas.microsoft.com/office/drawing/2016/ink" xmlns:am3d="http://schemas.microsoft.com/office/drawing/2017/model3d" xmlns:o="urn:schemas-microsoft-com:office:office" xmlns:oel="http://schemas.microsoft.com/office/2019/extlst" xmlns:r="http://schemas.openxmlformats.org/officeDocument/2006/relationships" xmlns:m="http://schemas.openxmlformats.org/officeDocument/2006/math" xmlns:v="urn:schemas-microsoft-com:vml" xmlns:wp14="http://schemas.microsoft.com/office/word/2010/wordprocessingDrawing" xmlns:wp="http://schemas.openxmlformats.org/drawingml/2006/wordprocessingDrawing" xmlns:w10="urn:schemas-microsoft-com:office:word" xmlns:w="http://schemas.openxmlformats.org/wordprocessingml/2006/main" xmlns:w14="http://schemas.microsoft.com/office/word/2010/wordml" xmlns:w15="http://schemas.microsoft.com/office/word/2012/wordml" xmlns:w16cex="http://schemas.microsoft.com/office/word/2018/wordml/cex" xmlns:w16cid="http://schemas.microsoft.com/office/word/2016/wordml/cid" xmlns:w16="http://schemas.microsoft.com/office/word/2018/wordml" xmlns:w16du="http://schemas.microsoft.com/office/word/2023/wordml/word16du" xmlns:w16sdtdh="http://schemas.microsoft.com/office/word/2020/wordml/sdtdatahash" xmlns:w16sdtfl="http://schemas.microsoft.com/office/word/2024/wordml/sdtformatlock" xmlns:w16se="http://schemas.microsoft.com/office/word/2015/wordml/symex" xmlns:wpg="http://schemas.microsoft.com/office/word/2010/wordprocessingGroup" xmlns:wpi="http://schemas.microsoft.com/office/word/2010/wordprocessingInk" xmlns:wne="http://schemas.microsoft.com/office/word/2006/wordml" xmlns:wps="http://schemas.microsoft.com/office/word/2010/wordprocessingShape" mc:Ignorable="w14 w15 w16se w16cid w16 w16cex w16sdtdh w16sdtfl w16du wp14">
+<w:numbering xmlns:wpc="http://schemas.microsoft.com/office/word/2010/wordprocessingCanvas" xmlns:cx="http://schemas.microsoft.com/office/drawing/2014/chartex" xmlns:cx1="http://schemas.microsoft.com/office/drawing/2015/9/8/chartex" xmlns:cx2="http://schemas.microsoft.com/office/drawing/2015/10/21/chartex" xmlns:cx3="http://schemas.microsoft.com/office/drawing/2016/5/9/chartex" xmlns:cx4="http://schemas.microsoft.com/office/drawing/2016/5/10/chartex" xmlns:cx5="http://schemas.microsoft.com/office/drawing/2016/5/11/chartex" xmlns:cx6="http://schemas.microsoft.com/office/drawing/2016/5/12/chartex" xmlns:cx7="http://schemas.microsoft.com/office/drawing/2016/5/13/chartex" xmlns:cx8="http://schemas.microsoft.com/office/drawing/2016/5/14/chartex" xmlns:mc="http://schemas.openxmlformats.org/markup-compatibility/2006" xmlns:aink="http://schemas.microsoft.com/office/drawing/2016/ink" xmlns:am3d="http://schemas.microsoft.com/office/drawing/2017/model3d" xmlns:o="urn:schemas-microsoft-com:office:office" xmlns:oel="http://schemas.microsoft.com/office/2019/extlst" xmlns:r="http://schemas.openxmlformats.org/officeDocument/2006/relationships" xmlns:m="http://schemas.openxmlformats.org/officeDocument/2006/math" xmlns:v="urn:schemas-microsoft-com:vml" xmlns:wp14="http://schemas.microsoft.com/office/word/2010/wordprocessingDrawing" xmlns:wp="http://schemas.openxmlformats.org/drawingml/2006/wordprocessingDrawing" xmlns:w10="urn:schemas-microsoft-com:office:word" xmlns:w="http://schemas.openxmlformats.org/wordprocessingml/2006/main" xmlns:w14="http://schemas.microsoft.com/office/word/2010/wordml" xmlns:w15="http://schemas.microsoft.com/office/word/2012/wordml" xmlns:w16cex="http://schemas.microsoft.com/office/word/2018/wordml/cex" xmlns:w16cid="http://schemas.microsoft.com/office/word/2016/wordml/cid" xmlns:w16="http://schemas.microsoft.com/office/word/2018/wordml" xmlns:w16sdtdh="http://schemas.microsoft.com/office/word/2020/wordml/sdtdatahash" xmlns:w16se="http://schemas.microsoft.com/office/word/2015/wordml/symex" xmlns:wpg="http://schemas.microsoft.com/office/word/2010/wordprocessingGroup" xmlns:wpi="http://schemas.microsoft.com/office/word/2010/wordprocessingInk" xmlns:wne="http://schemas.microsoft.com/office/word/2006/wordml" xmlns:wps="http://schemas.microsoft.com/office/word/2010/wordprocessingShape" mc:Ignorable="w14 w15 w16se w16cid w16 w16cex w16sdtdh wp14">
   <w:abstractNum w:abstractNumId="0" w15:restartNumberingAfterBreak="0">
     <w:nsid w:val="09FE0787"/>
     <w:multiLevelType w:val="hybridMultilevel"/>
@@ -60071,7 +60046,7 @@
 </file>
 
 <file path=word/styles.xml><?xml version="1.0" encoding="utf-8"?>
-<w:styles xmlns:mc="http://schemas.openxmlformats.org/markup-compatibility/2006" xmlns:r="http://schemas.openxmlformats.org/officeDocument/2006/relationships" xmlns:w="http://schemas.openxmlformats.org/wordprocessingml/2006/main" xmlns:w14="http://schemas.microsoft.com/office/word/2010/wordml" xmlns:w15="http://schemas.microsoft.com/office/word/2012/wordml" xmlns:w16cex="http://schemas.microsoft.com/office/word/2018/wordml/cex" xmlns:w16cid="http://schemas.microsoft.com/office/word/2016/wordml/cid" xmlns:w16="http://schemas.microsoft.com/office/word/2018/wordml" xmlns:w16du="http://schemas.microsoft.com/office/word/2023/wordml/word16du" xmlns:w16sdtdh="http://schemas.microsoft.com/office/word/2020/wordml/sdtdatahash" xmlns:w16sdtfl="http://schemas.microsoft.com/office/word/2024/wordml/sdtformatlock" xmlns:w16se="http://schemas.microsoft.com/office/word/2015/wordml/symex" mc:Ignorable="w14 w15 w16se w16cid w16 w16cex w16sdtdh w16sdtfl w16du">
+<w:styles xmlns:mc="http://schemas.openxmlformats.org/markup-compatibility/2006" xmlns:r="http://schemas.openxmlformats.org/officeDocument/2006/relationships" xmlns:w="http://schemas.openxmlformats.org/wordprocessingml/2006/main" xmlns:w14="http://schemas.microsoft.com/office/word/2010/wordml" xmlns:w15="http://schemas.microsoft.com/office/word/2012/wordml" xmlns:w16cex="http://schemas.microsoft.com/office/word/2018/wordml/cex" xmlns:w16cid="http://schemas.microsoft.com/office/word/2016/wordml/cid" xmlns:w16="http://schemas.microsoft.com/office/word/2018/wordml" xmlns:w16sdtdh="http://schemas.microsoft.com/office/word/2020/wordml/sdtdatahash" xmlns:w16se="http://schemas.microsoft.com/office/word/2015/wordml/symex" mc:Ignorable="w14 w15 w16se w16cid w16 w16cex w16sdtdh">
   <w:docDefaults>
     <w:rPrDefault>
       <w:rPr>

</xml_diff>

<commit_message>
update docx with appendix notes
</commit_message>
<xml_diff>
--- a/companion_notes/deep_dives/Deep_Dive_in_the_SPLM_model_and_code.docx
+++ b/companion_notes/deep_dives/Deep_Dive_in_the_SPLM_model_and_code.docx
@@ -4522,6 +4522,13 @@
         </w:rPr>
         <w:t xml:space="preserve"> in smoke test code, 512 with TinyShakespeare dataset, 768 with TinyStories dataset.</w:t>
       </w:r>
+      <w:r>
+        <w:rPr>
+          <w:rStyle w:val="FootnoteReference"/>
+          <w:rFonts w:eastAsiaTheme="minorEastAsia"/>
+        </w:rPr>
+        <w:footnoteReference w:id="2"/>
+      </w:r>
     </w:p>
     <w:p>
       <w:pPr>
@@ -4677,6 +4684,59 @@
           <w:rFonts w:eastAsiaTheme="minorEastAsia"/>
         </w:rPr>
         <w:t xml:space="preserve"> otherwise.</w:t>
+      </w:r>
+    </w:p>
+    <w:p>
+      <w:pPr>
+        <w:rPr>
+          <w:rFonts w:eastAsiaTheme="minorEastAsia"/>
+        </w:rPr>
+      </w:pPr>
+      <m:oMath>
+        <m:r>
+          <w:rPr>
+            <w:rFonts w:ascii="Cambria Math" w:eastAsiaTheme="minorEastAsia" w:hAnsi="Cambria Math"/>
+          </w:rPr>
+          <m:t>K</m:t>
+        </m:r>
+      </m:oMath>
+      <w:r>
+        <w:rPr>
+          <w:rFonts w:eastAsiaTheme="minorEastAsia"/>
+        </w:rPr>
+        <w:t xml:space="preserve"> </w:t>
+      </w:r>
+      <w:r>
+        <w:rPr>
+          <w:rFonts w:eastAsiaTheme="minorEastAsia"/>
+        </w:rPr>
+        <w:t>–</w:t>
+      </w:r>
+      <w:r>
+        <w:rPr>
+          <w:rFonts w:eastAsiaTheme="minorEastAsia"/>
+        </w:rPr>
+        <w:t xml:space="preserve"> </w:t>
+      </w:r>
+      <w:r>
+        <w:rPr>
+          <w:rFonts w:eastAsiaTheme="minorEastAsia"/>
+        </w:rPr>
+        <w:t>number of multi-</w:t>
+      </w:r>
+      <m:oMath>
+        <m:r>
+          <w:rPr>
+            <w:rFonts w:ascii="Cambria Math" w:eastAsiaTheme="minorEastAsia" w:hAnsi="Cambria Math"/>
+          </w:rPr>
+          <m:t>ξ</m:t>
+        </m:r>
+      </m:oMath>
+      <w:r>
+        <w:rPr>
+          <w:rFonts w:eastAsiaTheme="minorEastAsia"/>
+        </w:rPr>
+        <w:t xml:space="preserve"> context channels</w:t>
       </w:r>
     </w:p>
     <w:p/>
@@ -4994,7 +5054,7 @@
             <w:rFonts w:ascii="Cambria Math" w:eastAsiaTheme="minorEastAsia" w:hAnsi="Cambria Math"/>
             <w:i/>
           </w:rPr>
-          <w:footnoteReference w:id="2"/>
+          <w:footnoteReference w:id="3"/>
         </m:r>
       </m:oMath>
       <w:r>
@@ -5535,6 +5595,7 @@
     </w:p>
     <w:p>
       <w:r>
+        <w:lastRenderedPageBreak/>
         <w:t xml:space="preserve">In SPLM context and in the context </w:t>
       </w:r>
       <w:r>
@@ -5780,14 +5841,7 @@
         <w:rPr>
           <w:rFonts w:eastAsiaTheme="minorEastAsia"/>
         </w:rPr>
-        <w:t xml:space="preserve"> that </w:t>
-      </w:r>
-      <w:r>
-        <w:rPr>
-          <w:rFonts w:eastAsiaTheme="minorEastAsia"/>
-        </w:rPr>
-        <w:lastRenderedPageBreak/>
-        <w:t xml:space="preserve">each sub-layer additively updates via </w:t>
+        <w:t xml:space="preserve"> that each sub-layer additively updates via </w:t>
       </w:r>
       <m:oMath>
         <m:sSup>
@@ -8627,6 +8681,7 @@
         </w:rPr>
       </w:pPr>
       <w:r>
+        <w:lastRenderedPageBreak/>
         <w:t xml:space="preserve">Three modes in the SARF-mass variant: </w:t>
       </w:r>
       <w:r>
@@ -9205,7 +9260,6 @@
           <w:rPr>
             <w:rFonts w:ascii="Cambria Math" w:hAnsi="Cambria Math"/>
           </w:rPr>
-          <w:lastRenderedPageBreak/>
           <m:t>γ</m:t>
         </m:r>
       </m:oMath>
@@ -10994,6 +11048,7 @@
         <w:rPr>
           <w:rFonts w:eastAsiaTheme="minorEastAsia"/>
         </w:rPr>
+        <w:lastRenderedPageBreak/>
         <w:t>Oracle-Fit Quantities</w:t>
       </w:r>
       <w:bookmarkEnd w:id="7"/>
@@ -13731,6 +13786,7 @@
           <w:rPr>
             <w:rFonts w:ascii="Cambria Math" w:eastAsiaTheme="minorEastAsia" w:hAnsi="Cambria Math"/>
           </w:rPr>
+          <w:lastRenderedPageBreak/>
           <m:t>ξ</m:t>
         </m:r>
       </m:oMath>
@@ -14154,14 +14210,7 @@
         <w:rPr>
           <w:rFonts w:eastAsiaTheme="minorEastAsia"/>
         </w:rPr>
-        <w:t xml:space="preserve"> is re-pooled at every step from </w:t>
-      </w:r>
-      <w:r>
-        <w:rPr>
-          <w:rFonts w:eastAsiaTheme="minorEastAsia"/>
-        </w:rPr>
-        <w:lastRenderedPageBreak/>
-        <w:t xml:space="preserve">h.detach(), enforcing the same invariant dynamically. The </w:t>
+        <w:t xml:space="preserve"> is re-pooled at every step from h.detach(), enforcing the same invariant dynamically. The </w:t>
       </w:r>
       <w:r>
         <w:rPr>
@@ -14997,6 +15046,7 @@
         </w:rPr>
       </w:pPr>
       <w:r>
+        <w:lastRenderedPageBreak/>
         <w:t xml:space="preserve">The final 1-unit output makes </w:t>
       </w:r>
       <m:oMath>
@@ -15281,7 +15331,6 @@
           <w:rPr>
             <w:rFonts w:ascii="Cambria Math" w:eastAsiaTheme="minorEastAsia" w:hAnsi="Cambria Math"/>
           </w:rPr>
-          <w:lastRenderedPageBreak/>
           <m:t>ξ</m:t>
         </m:r>
       </m:oMath>
@@ -17466,6 +17515,7 @@
     </w:p>
     <w:p>
       <w:r>
+        <w:lastRenderedPageBreak/>
         <w:t xml:space="preserve"> The gradient regressor </w:t>
       </w:r>
       <m:oMath>
@@ -17541,11 +17591,7 @@
         <w:t>h_l</w:t>
       </w:r>
       <w:r>
-        <w:t xml:space="preserve"> the model visits when it replays the sentence. The oracle does not re-learn an energy landscape — it reuses the one the </w:t>
-      </w:r>
-      <w:r>
-        <w:lastRenderedPageBreak/>
-        <w:t>network already learned and only asks how well a single per-layer rescaling of that landscape's force reproduces the observed motion.</w:t>
+        <w:t xml:space="preserve"> the model visits when it replays the sentence. The oracle does not re-learn an energy landscape — it reuses the one the network already learned and only asks how well a single per-layer rescaling of that landscape's force reproduces the observed motion.</w:t>
       </w:r>
     </w:p>
     <w:p/>
@@ -18025,7 +18071,11 @@
         <w:t>gamma</w:t>
       </w:r>
       <w:r>
-        <w:t xml:space="preserve"> are shaped solely by the requirement that the depth-</w:t>
+        <w:t xml:space="preserve"> are shaped solely by the </w:t>
+      </w:r>
+      <w:r>
+        <w:lastRenderedPageBreak/>
+        <w:t>requirement that the depth-</w:t>
       </w:r>
       <w:r>
         <w:rPr>
@@ -18060,7 +18110,6 @@
     </w:p>
     <w:p>
       <w:r>
-        <w:lastRenderedPageBreak/>
         <w:t xml:space="preserve">What makes this non-trivial is that the loss gradient must pass through the force computation at every step. Inside </w:t>
       </w:r>
       <w:r>
@@ -18838,11 +18887,11 @@
         <w:t>Delta x_l ~= alpha_l v_l - beta_l grad V_psi(x_l)</w:t>
       </w:r>
       <w:r>
-        <w:t xml:space="preserve">. The interesting word is *single*. A per-layer symmetric operator (the subject of the next section) is a weak constraint; demanding that one smooth </w:t>
+        <w:t xml:space="preserve">. The interesting word is *single*. A </w:t>
       </w:r>
       <w:r>
         <w:lastRenderedPageBreak/>
-        <w:t>scalar explain twelve layers of behaviour at once is a far stronger one, and it is exactly the property that distinguishes a true physical potential from a layer-wise curve-fit.</w:t>
+        <w:t>per-layer symmetric operator (the subject of the next section) is a weak constraint; demanding that one smooth scalar explain twelve layers of behaviour at once is a far stronger one, and it is exactly the property that distinguishes a true physical potential from a layer-wise curve-fit.</w:t>
       </w:r>
     </w:p>
     <w:p/>
@@ -21287,6 +21336,20 @@
           <w:rFonts w:eastAsiaTheme="minorEastAsia"/>
         </w:rPr>
       </w:pPr>
+      <w:proofErr w:type="gramStart"/>
+      <w:r>
+        <w:rPr>
+          <w:rFonts w:eastAsiaTheme="minorEastAsia"/>
+        </w:rPr>
+        <w:t>So</w:t>
+      </w:r>
+      <w:proofErr w:type="gramEnd"/>
+      <w:r>
+        <w:rPr>
+          <w:rFonts w:eastAsiaTheme="minorEastAsia"/>
+        </w:rPr>
+        <w:t xml:space="preserve"> the first layer already sees </w:t>
+      </w:r>
     </w:p>
     <w:p/>
     <w:p/>
@@ -21647,7 +21710,7 @@
             <w:rFonts w:ascii="Cambria Math" w:eastAsiaTheme="minorEastAsia" w:hAnsi="Cambria Math"/>
             <w:i/>
           </w:rPr>
-          <w:footnoteReference w:id="3"/>
+          <w:footnoteReference w:id="4"/>
         </m:r>
       </m:oMath>
       <w:r>
@@ -35661,7 +35724,7 @@
           <w:sz w:val="17"/>
           <w:szCs w:val="17"/>
         </w:rPr>
-        <w:footnoteReference w:id="4"/>
+        <w:footnoteReference w:id="5"/>
       </w:r>
       <w:r>
         <w:t xml:space="preserve"> is a learned, strictly-positive gain on that surprisal.</w:t>
@@ -60211,6 +60274,59 @@
         <w:footnoteRef/>
       </w:r>
       <w:r>
+        <w:t xml:space="preserve"> See the Note on the MLP </w:t>
+      </w:r>
+      <m:oMath>
+        <m:sSub>
+          <m:sSubPr>
+            <m:ctrlPr>
+              <w:rPr>
+                <w:rFonts w:ascii="Cambria Math" w:hAnsi="Cambria Math"/>
+                <w:i/>
+              </w:rPr>
+            </m:ctrlPr>
+          </m:sSubPr>
+          <m:e>
+            <m:r>
+              <w:rPr>
+                <w:rFonts w:ascii="Cambria Math" w:hAnsi="Cambria Math"/>
+              </w:rPr>
+              <m:t>V</m:t>
+            </m:r>
+          </m:e>
+          <m:sub>
+            <m:r>
+              <w:rPr>
+                <w:rFonts w:ascii="Cambria Math" w:hAnsi="Cambria Math"/>
+              </w:rPr>
+              <m:t>θ</m:t>
+            </m:r>
+          </m:sub>
+        </m:sSub>
+      </m:oMath>
+      <w:r>
+        <w:rPr>
+          <w:rFonts w:eastAsiaTheme="minorEastAsia"/>
+        </w:rPr>
+        <w:t xml:space="preserve"> hidden width</w:t>
+      </w:r>
+      <w:r>
+        <w:t xml:space="preserve"> in the Appendix</w:t>
+      </w:r>
+    </w:p>
+  </w:footnote>
+  <w:footnote w:id="3">
+    <w:p>
+      <w:pPr>
+        <w:pStyle w:val="FootnoteText"/>
+      </w:pPr>
+      <w:r>
+        <w:rPr>
+          <w:rStyle w:val="FootnoteReference"/>
+        </w:rPr>
+        <w:footnoteRef/>
+      </w:r>
+      <w:r>
         <w:t xml:space="preserve"> </w:t>
       </w:r>
       <w:r>
@@ -60243,7 +60359,7 @@
       </w:r>
     </w:p>
   </w:footnote>
-  <w:footnote w:id="3">
+  <w:footnote w:id="4">
     <w:p>
       <w:pPr>
         <w:pStyle w:val="FootnoteText"/>
@@ -60386,7 +60502,7 @@
       </w:r>
     </w:p>
   </w:footnote>
-  <w:footnote w:id="4">
+  <w:footnote w:id="5">
     <w:p>
       <w:pPr>
         <w:pStyle w:val="FootnoteText"/>

</xml_diff>